<commit_message>
Code updated data analytics on 17-06-25
</commit_message>
<xml_diff>
--- a/SQL Server/Query.docx
+++ b/SQL Server/Query.docx
@@ -77,18 +77,7 @@
           <w:sz w:val="19"/>
           <w:szCs w:val="19"/>
         </w:rPr>
-        <w:t>--SELECT, WHERE, D</w:t>
-      </w:r>
-      <w:bookmarkStart w:id="0" w:name="_GoBack"/>
-      <w:bookmarkEnd w:id="0"/>
-      <w:r>
-        <w:rPr>
-          <w:rFonts w:ascii="Consolas" w:hAnsi="Consolas" w:cs="Consolas"/>
-          <w:color w:val="008000"/>
-          <w:sz w:val="19"/>
-          <w:szCs w:val="19"/>
-        </w:rPr>
-        <w:t>ISTINCT, LIKE, BETWEEN, ORDER BY, LIMIT, GROUP BY, HAVING CLAUSE, INSERT, UPDATE, ALTER, IMPORT, Data types</w:t>
+        <w:t>--SELECT, WHERE, DISTINCT, LIKE, BETWEEN, ORDER BY, LIMIT, GROUP BY, HAVING CLAUSE, INSERT, UPDATE, ALTER, IMPORT, Data types</w:t>
       </w:r>
     </w:p>
     <w:p>
@@ -521,16 +510,7 @@
           <w:sz w:val="19"/>
           <w:szCs w:val="19"/>
         </w:rPr>
-        <w:t>--select count(*) as totalrec, EmpId, EName from Employee_N group by EmpId, EName having EmpId &gt;3</w:t>
-      </w:r>
-      <w:r>
-        <w:rPr>
-          <w:rFonts w:ascii="Consolas" w:hAnsi="Consolas" w:cs="Consolas"/>
-          <w:color w:val="008000"/>
-          <w:sz w:val="19"/>
-          <w:szCs w:val="19"/>
-        </w:rPr>
-        <w:t xml:space="preserve"> --having</w:t>
+        <w:t>--select count(*) as totalrec, EmpId, EName from Employee_N group by EmpId, EName having EmpId &gt;3 --having</w:t>
       </w:r>
     </w:p>
     <w:p>
@@ -742,6 +722,12 @@
     </w:p>
     <w:p>
       <w:pPr>
+        <w:pBdr>
+          <w:top w:val="single" w:sz="4" w:space="1" w:color="auto"/>
+          <w:left w:val="single" w:sz="4" w:space="1" w:color="auto"/>
+          <w:bottom w:val="single" w:sz="4" w:space="1" w:color="auto"/>
+          <w:right w:val="single" w:sz="4" w:space="1" w:color="auto"/>
+        </w:pBdr>
         <w:autoSpaceDE w:val="0"/>
         <w:autoSpaceDN w:val="0"/>
         <w:adjustRightInd w:val="0"/>
@@ -765,20 +751,27 @@
     </w:p>
     <w:p>
       <w:pPr>
-        <w:autoSpaceDE w:val="0"/>
-        <w:autoSpaceDN w:val="0"/>
-        <w:adjustRightInd w:val="0"/>
-        <w:spacing w:after="0" w:line="240" w:lineRule="auto"/>
-        <w:rPr>
-          <w:rFonts w:ascii="Consolas" w:hAnsi="Consolas" w:cs="Consolas"/>
-          <w:sz w:val="19"/>
-          <w:szCs w:val="19"/>
-        </w:rPr>
-      </w:pPr>
-      <w:r>
-        <w:rPr>
-          <w:rFonts w:ascii="Consolas" w:hAnsi="Consolas" w:cs="Consolas"/>
-          <w:color w:val="008000"/>
+        <w:pBdr>
+          <w:top w:val="single" w:sz="4" w:space="1" w:color="auto"/>
+          <w:left w:val="single" w:sz="4" w:space="1" w:color="auto"/>
+          <w:bottom w:val="single" w:sz="4" w:space="1" w:color="auto"/>
+          <w:right w:val="single" w:sz="4" w:space="1" w:color="auto"/>
+        </w:pBdr>
+        <w:autoSpaceDE w:val="0"/>
+        <w:autoSpaceDN w:val="0"/>
+        <w:adjustRightInd w:val="0"/>
+        <w:spacing w:after="0" w:line="240" w:lineRule="auto"/>
+        <w:rPr>
+          <w:rFonts w:ascii="Consolas" w:hAnsi="Consolas" w:cs="Consolas"/>
+          <w:b/>
+          <w:sz w:val="19"/>
+          <w:szCs w:val="19"/>
+        </w:rPr>
+      </w:pPr>
+      <w:r>
+        <w:rPr>
+          <w:rFonts w:ascii="Consolas" w:hAnsi="Consolas" w:cs="Consolas"/>
+          <w:b/>
           <w:sz w:val="19"/>
           <w:szCs w:val="19"/>
         </w:rPr>
@@ -787,6 +780,12 @@
     </w:p>
     <w:p>
       <w:pPr>
+        <w:pBdr>
+          <w:top w:val="single" w:sz="4" w:space="1" w:color="auto"/>
+          <w:left w:val="single" w:sz="4" w:space="1" w:color="auto"/>
+          <w:bottom w:val="single" w:sz="4" w:space="1" w:color="auto"/>
+          <w:right w:val="single" w:sz="4" w:space="1" w:color="auto"/>
+        </w:pBdr>
         <w:autoSpaceDE w:val="0"/>
         <w:autoSpaceDN w:val="0"/>
         <w:adjustRightInd w:val="0"/>
@@ -839,6 +838,12 @@
     </w:p>
     <w:p>
       <w:pPr>
+        <w:pBdr>
+          <w:top w:val="single" w:sz="4" w:space="1" w:color="auto"/>
+          <w:left w:val="single" w:sz="4" w:space="1" w:color="auto"/>
+          <w:bottom w:val="single" w:sz="4" w:space="1" w:color="auto"/>
+          <w:right w:val="single" w:sz="4" w:space="1" w:color="auto"/>
+        </w:pBdr>
         <w:autoSpaceDE w:val="0"/>
         <w:autoSpaceDN w:val="0"/>
         <w:adjustRightInd w:val="0"/>
@@ -891,6 +896,12 @@
     </w:p>
     <w:p>
       <w:pPr>
+        <w:pBdr>
+          <w:top w:val="single" w:sz="4" w:space="1" w:color="auto"/>
+          <w:left w:val="single" w:sz="4" w:space="1" w:color="auto"/>
+          <w:bottom w:val="single" w:sz="4" w:space="1" w:color="auto"/>
+          <w:right w:val="single" w:sz="4" w:space="1" w:color="auto"/>
+        </w:pBdr>
         <w:autoSpaceDE w:val="0"/>
         <w:autoSpaceDN w:val="0"/>
         <w:adjustRightInd w:val="0"/>
@@ -943,6 +954,12 @@
     </w:p>
     <w:p>
       <w:pPr>
+        <w:pBdr>
+          <w:top w:val="single" w:sz="4" w:space="1" w:color="auto"/>
+          <w:left w:val="single" w:sz="4" w:space="1" w:color="auto"/>
+          <w:bottom w:val="single" w:sz="4" w:space="1" w:color="auto"/>
+          <w:right w:val="single" w:sz="4" w:space="1" w:color="auto"/>
+        </w:pBdr>
         <w:autoSpaceDE w:val="0"/>
         <w:autoSpaceDN w:val="0"/>
         <w:adjustRightInd w:val="0"/>
@@ -995,6 +1012,12 @@
     </w:p>
     <w:p>
       <w:pPr>
+        <w:pBdr>
+          <w:top w:val="single" w:sz="4" w:space="1" w:color="auto"/>
+          <w:left w:val="single" w:sz="4" w:space="1" w:color="auto"/>
+          <w:bottom w:val="single" w:sz="4" w:space="1" w:color="auto"/>
+          <w:right w:val="single" w:sz="4" w:space="1" w:color="auto"/>
+        </w:pBdr>
         <w:autoSpaceDE w:val="0"/>
         <w:autoSpaceDN w:val="0"/>
         <w:adjustRightInd w:val="0"/>
@@ -1047,6 +1070,12 @@
     </w:p>
     <w:p>
       <w:pPr>
+        <w:pBdr>
+          <w:top w:val="single" w:sz="4" w:space="1" w:color="auto"/>
+          <w:left w:val="single" w:sz="4" w:space="1" w:color="auto"/>
+          <w:bottom w:val="single" w:sz="4" w:space="1" w:color="auto"/>
+          <w:right w:val="single" w:sz="4" w:space="1" w:color="auto"/>
+        </w:pBdr>
         <w:autoSpaceDE w:val="0"/>
         <w:autoSpaceDN w:val="0"/>
         <w:adjustRightInd w:val="0"/>
@@ -1099,6 +1128,12 @@
     </w:p>
     <w:p>
       <w:pPr>
+        <w:pBdr>
+          <w:top w:val="single" w:sz="4" w:space="1" w:color="auto"/>
+          <w:left w:val="single" w:sz="4" w:space="1" w:color="auto"/>
+          <w:bottom w:val="single" w:sz="4" w:space="1" w:color="auto"/>
+          <w:right w:val="single" w:sz="4" w:space="1" w:color="auto"/>
+        </w:pBdr>
         <w:autoSpaceDE w:val="0"/>
         <w:autoSpaceDN w:val="0"/>
         <w:adjustRightInd w:val="0"/>
@@ -1151,6 +1186,12 @@
     </w:p>
     <w:p>
       <w:pPr>
+        <w:pBdr>
+          <w:top w:val="single" w:sz="4" w:space="1" w:color="auto"/>
+          <w:left w:val="single" w:sz="4" w:space="1" w:color="auto"/>
+          <w:bottom w:val="single" w:sz="4" w:space="1" w:color="auto"/>
+          <w:right w:val="single" w:sz="4" w:space="1" w:color="auto"/>
+        </w:pBdr>
         <w:autoSpaceDE w:val="0"/>
         <w:autoSpaceDN w:val="0"/>
         <w:adjustRightInd w:val="0"/>
@@ -1203,6 +1244,12 @@
     </w:p>
     <w:p>
       <w:pPr>
+        <w:pBdr>
+          <w:top w:val="single" w:sz="4" w:space="1" w:color="auto"/>
+          <w:left w:val="single" w:sz="4" w:space="1" w:color="auto"/>
+          <w:bottom w:val="single" w:sz="4" w:space="1" w:color="auto"/>
+          <w:right w:val="single" w:sz="4" w:space="1" w:color="auto"/>
+        </w:pBdr>
         <w:autoSpaceDE w:val="0"/>
         <w:autoSpaceDN w:val="0"/>
         <w:adjustRightInd w:val="0"/>
@@ -1255,6 +1302,12 @@
     </w:p>
     <w:p>
       <w:pPr>
+        <w:pBdr>
+          <w:top w:val="single" w:sz="4" w:space="1" w:color="auto"/>
+          <w:left w:val="single" w:sz="4" w:space="1" w:color="auto"/>
+          <w:bottom w:val="single" w:sz="4" w:space="1" w:color="auto"/>
+          <w:right w:val="single" w:sz="4" w:space="1" w:color="auto"/>
+        </w:pBdr>
         <w:autoSpaceDE w:val="0"/>
         <w:autoSpaceDN w:val="0"/>
         <w:adjustRightInd w:val="0"/>
@@ -1307,6 +1360,12 @@
     </w:p>
     <w:p>
       <w:pPr>
+        <w:pBdr>
+          <w:top w:val="single" w:sz="4" w:space="1" w:color="auto"/>
+          <w:left w:val="single" w:sz="4" w:space="1" w:color="auto"/>
+          <w:bottom w:val="single" w:sz="4" w:space="1" w:color="auto"/>
+          <w:right w:val="single" w:sz="4" w:space="1" w:color="auto"/>
+        </w:pBdr>
         <w:autoSpaceDE w:val="0"/>
         <w:autoSpaceDN w:val="0"/>
         <w:adjustRightInd w:val="0"/>
@@ -1329,34 +1388,46 @@
     </w:p>
     <w:p>
       <w:pPr>
-        <w:autoSpaceDE w:val="0"/>
-        <w:autoSpaceDN w:val="0"/>
-        <w:adjustRightInd w:val="0"/>
-        <w:spacing w:after="0" w:line="240" w:lineRule="auto"/>
-        <w:rPr>
-          <w:rFonts w:ascii="Consolas" w:hAnsi="Consolas" w:cs="Consolas"/>
-          <w:color w:val="008000"/>
-          <w:sz w:val="19"/>
-          <w:szCs w:val="19"/>
-        </w:rPr>
-      </w:pPr>
-    </w:p>
-    <w:p>
-      <w:pPr>
-        <w:autoSpaceDE w:val="0"/>
-        <w:autoSpaceDN w:val="0"/>
-        <w:adjustRightInd w:val="0"/>
-        <w:spacing w:after="0" w:line="240" w:lineRule="auto"/>
-        <w:rPr>
-          <w:rFonts w:ascii="Consolas" w:hAnsi="Consolas" w:cs="Consolas"/>
-          <w:sz w:val="19"/>
-          <w:szCs w:val="19"/>
-        </w:rPr>
-      </w:pPr>
-      <w:r>
-        <w:rPr>
-          <w:rFonts w:ascii="Consolas" w:hAnsi="Consolas" w:cs="Consolas"/>
-          <w:color w:val="008000"/>
+        <w:pBdr>
+          <w:top w:val="single" w:sz="4" w:space="1" w:color="auto"/>
+          <w:left w:val="single" w:sz="4" w:space="1" w:color="auto"/>
+          <w:bottom w:val="single" w:sz="4" w:space="1" w:color="auto"/>
+          <w:right w:val="single" w:sz="4" w:space="1" w:color="auto"/>
+        </w:pBdr>
+        <w:autoSpaceDE w:val="0"/>
+        <w:autoSpaceDN w:val="0"/>
+        <w:adjustRightInd w:val="0"/>
+        <w:spacing w:after="0" w:line="240" w:lineRule="auto"/>
+        <w:rPr>
+          <w:rFonts w:ascii="Consolas" w:hAnsi="Consolas" w:cs="Consolas"/>
+          <w:color w:val="008000"/>
+          <w:sz w:val="19"/>
+          <w:szCs w:val="19"/>
+        </w:rPr>
+      </w:pPr>
+    </w:p>
+    <w:p>
+      <w:pPr>
+        <w:pBdr>
+          <w:top w:val="single" w:sz="4" w:space="1" w:color="auto"/>
+          <w:left w:val="single" w:sz="4" w:space="1" w:color="auto"/>
+          <w:bottom w:val="single" w:sz="4" w:space="1" w:color="auto"/>
+          <w:right w:val="single" w:sz="4" w:space="1" w:color="auto"/>
+        </w:pBdr>
+        <w:autoSpaceDE w:val="0"/>
+        <w:autoSpaceDN w:val="0"/>
+        <w:adjustRightInd w:val="0"/>
+        <w:spacing w:after="0" w:line="240" w:lineRule="auto"/>
+        <w:rPr>
+          <w:rFonts w:ascii="Consolas" w:hAnsi="Consolas" w:cs="Consolas"/>
+          <w:sz w:val="19"/>
+          <w:szCs w:val="19"/>
+        </w:rPr>
+      </w:pPr>
+      <w:r>
+        <w:rPr>
+          <w:rFonts w:ascii="Consolas" w:hAnsi="Consolas" w:cs="Consolas"/>
+          <w:b/>
           <w:sz w:val="19"/>
           <w:szCs w:val="19"/>
         </w:rPr>
@@ -1365,6 +1436,12 @@
     </w:p>
     <w:p>
       <w:pPr>
+        <w:pBdr>
+          <w:top w:val="single" w:sz="4" w:space="1" w:color="auto"/>
+          <w:left w:val="single" w:sz="4" w:space="1" w:color="auto"/>
+          <w:bottom w:val="single" w:sz="4" w:space="1" w:color="auto"/>
+          <w:right w:val="single" w:sz="4" w:space="1" w:color="auto"/>
+        </w:pBdr>
         <w:autoSpaceDE w:val="0"/>
         <w:autoSpaceDN w:val="0"/>
         <w:adjustRightInd w:val="0"/>
@@ -1407,6 +1484,12 @@
     </w:p>
     <w:p>
       <w:pPr>
+        <w:pBdr>
+          <w:top w:val="single" w:sz="4" w:space="1" w:color="auto"/>
+          <w:left w:val="single" w:sz="4" w:space="1" w:color="auto"/>
+          <w:bottom w:val="single" w:sz="4" w:space="1" w:color="auto"/>
+          <w:right w:val="single" w:sz="4" w:space="1" w:color="auto"/>
+        </w:pBdr>
         <w:autoSpaceDE w:val="0"/>
         <w:autoSpaceDN w:val="0"/>
         <w:adjustRightInd w:val="0"/>
@@ -1449,6 +1532,12 @@
     </w:p>
     <w:p>
       <w:pPr>
+        <w:pBdr>
+          <w:top w:val="single" w:sz="4" w:space="1" w:color="auto"/>
+          <w:left w:val="single" w:sz="4" w:space="1" w:color="auto"/>
+          <w:bottom w:val="single" w:sz="4" w:space="1" w:color="auto"/>
+          <w:right w:val="single" w:sz="4" w:space="1" w:color="auto"/>
+        </w:pBdr>
         <w:autoSpaceDE w:val="0"/>
         <w:autoSpaceDN w:val="0"/>
         <w:adjustRightInd w:val="0"/>
@@ -1491,6 +1580,12 @@
     </w:p>
     <w:p>
       <w:pPr>
+        <w:pBdr>
+          <w:top w:val="single" w:sz="4" w:space="1" w:color="auto"/>
+          <w:left w:val="single" w:sz="4" w:space="1" w:color="auto"/>
+          <w:bottom w:val="single" w:sz="4" w:space="1" w:color="auto"/>
+          <w:right w:val="single" w:sz="4" w:space="1" w:color="auto"/>
+        </w:pBdr>
         <w:autoSpaceDE w:val="0"/>
         <w:autoSpaceDN w:val="0"/>
         <w:adjustRightInd w:val="0"/>
@@ -1533,6 +1628,12 @@
     </w:p>
     <w:p>
       <w:pPr>
+        <w:pBdr>
+          <w:top w:val="single" w:sz="4" w:space="1" w:color="auto"/>
+          <w:left w:val="single" w:sz="4" w:space="1" w:color="auto"/>
+          <w:bottom w:val="single" w:sz="4" w:space="1" w:color="auto"/>
+          <w:right w:val="single" w:sz="4" w:space="1" w:color="auto"/>
+        </w:pBdr>
         <w:autoSpaceDE w:val="0"/>
         <w:autoSpaceDN w:val="0"/>
         <w:adjustRightInd w:val="0"/>
@@ -1576,6 +1677,12 @@
     </w:p>
     <w:p>
       <w:pPr>
+        <w:pBdr>
+          <w:top w:val="single" w:sz="4" w:space="1" w:color="auto"/>
+          <w:left w:val="single" w:sz="4" w:space="1" w:color="auto"/>
+          <w:bottom w:val="single" w:sz="4" w:space="1" w:color="auto"/>
+          <w:right w:val="single" w:sz="4" w:space="1" w:color="auto"/>
+        </w:pBdr>
         <w:autoSpaceDE w:val="0"/>
         <w:autoSpaceDN w:val="0"/>
         <w:adjustRightInd w:val="0"/>
@@ -1618,6 +1725,12 @@
     </w:p>
     <w:p>
       <w:pPr>
+        <w:pBdr>
+          <w:top w:val="single" w:sz="4" w:space="1" w:color="auto"/>
+          <w:left w:val="single" w:sz="4" w:space="1" w:color="auto"/>
+          <w:bottom w:val="single" w:sz="4" w:space="1" w:color="auto"/>
+          <w:right w:val="single" w:sz="4" w:space="1" w:color="auto"/>
+        </w:pBdr>
         <w:autoSpaceDE w:val="0"/>
         <w:autoSpaceDN w:val="0"/>
         <w:adjustRightInd w:val="0"/>
@@ -1650,6 +1763,12 @@
     </w:p>
     <w:p>
       <w:pPr>
+        <w:pBdr>
+          <w:top w:val="single" w:sz="4" w:space="1" w:color="auto"/>
+          <w:left w:val="single" w:sz="4" w:space="1" w:color="auto"/>
+          <w:bottom w:val="single" w:sz="4" w:space="1" w:color="auto"/>
+          <w:right w:val="single" w:sz="4" w:space="1" w:color="auto"/>
+        </w:pBdr>
         <w:autoSpaceDE w:val="0"/>
         <w:autoSpaceDN w:val="0"/>
         <w:adjustRightInd w:val="0"/>
@@ -1672,19 +1791,31 @@
     </w:p>
     <w:p>
       <w:pPr>
-        <w:autoSpaceDE w:val="0"/>
-        <w:autoSpaceDN w:val="0"/>
-        <w:adjustRightInd w:val="0"/>
-        <w:spacing w:after="0" w:line="240" w:lineRule="auto"/>
-        <w:rPr>
-          <w:rFonts w:ascii="Consolas" w:hAnsi="Consolas" w:cs="Consolas"/>
-          <w:sz w:val="19"/>
-          <w:szCs w:val="19"/>
-        </w:rPr>
-      </w:pPr>
-    </w:p>
-    <w:p>
-      <w:pPr>
+        <w:pBdr>
+          <w:top w:val="single" w:sz="4" w:space="1" w:color="auto"/>
+          <w:left w:val="single" w:sz="4" w:space="1" w:color="auto"/>
+          <w:bottom w:val="single" w:sz="4" w:space="1" w:color="auto"/>
+          <w:right w:val="single" w:sz="4" w:space="1" w:color="auto"/>
+        </w:pBdr>
+        <w:autoSpaceDE w:val="0"/>
+        <w:autoSpaceDN w:val="0"/>
+        <w:adjustRightInd w:val="0"/>
+        <w:spacing w:after="0" w:line="240" w:lineRule="auto"/>
+        <w:rPr>
+          <w:rFonts w:ascii="Consolas" w:hAnsi="Consolas" w:cs="Consolas"/>
+          <w:sz w:val="19"/>
+          <w:szCs w:val="19"/>
+        </w:rPr>
+      </w:pPr>
+    </w:p>
+    <w:p>
+      <w:pPr>
+        <w:pBdr>
+          <w:top w:val="single" w:sz="4" w:space="1" w:color="auto"/>
+          <w:left w:val="single" w:sz="4" w:space="1" w:color="auto"/>
+          <w:bottom w:val="single" w:sz="4" w:space="1" w:color="auto"/>
+          <w:right w:val="single" w:sz="4" w:space="1" w:color="auto"/>
+        </w:pBdr>
         <w:autoSpaceDE w:val="0"/>
         <w:autoSpaceDN w:val="0"/>
         <w:adjustRightInd w:val="0"/>
@@ -1707,19 +1838,31 @@
     </w:p>
     <w:p>
       <w:pPr>
-        <w:autoSpaceDE w:val="0"/>
-        <w:autoSpaceDN w:val="0"/>
-        <w:adjustRightInd w:val="0"/>
-        <w:spacing w:after="0" w:line="240" w:lineRule="auto"/>
-        <w:rPr>
-          <w:rFonts w:ascii="Consolas" w:hAnsi="Consolas" w:cs="Consolas"/>
-          <w:sz w:val="19"/>
-          <w:szCs w:val="19"/>
-        </w:rPr>
-      </w:pPr>
-    </w:p>
-    <w:p>
-      <w:pPr>
+        <w:pBdr>
+          <w:top w:val="single" w:sz="4" w:space="1" w:color="auto"/>
+          <w:left w:val="single" w:sz="4" w:space="1" w:color="auto"/>
+          <w:bottom w:val="single" w:sz="4" w:space="1" w:color="auto"/>
+          <w:right w:val="single" w:sz="4" w:space="1" w:color="auto"/>
+        </w:pBdr>
+        <w:autoSpaceDE w:val="0"/>
+        <w:autoSpaceDN w:val="0"/>
+        <w:adjustRightInd w:val="0"/>
+        <w:spacing w:after="0" w:line="240" w:lineRule="auto"/>
+        <w:rPr>
+          <w:rFonts w:ascii="Consolas" w:hAnsi="Consolas" w:cs="Consolas"/>
+          <w:sz w:val="19"/>
+          <w:szCs w:val="19"/>
+        </w:rPr>
+      </w:pPr>
+    </w:p>
+    <w:p>
+      <w:pPr>
+        <w:pBdr>
+          <w:top w:val="single" w:sz="4" w:space="1" w:color="auto"/>
+          <w:left w:val="single" w:sz="4" w:space="1" w:color="auto"/>
+          <w:bottom w:val="single" w:sz="4" w:space="1" w:color="auto"/>
+          <w:right w:val="single" w:sz="4" w:space="1" w:color="auto"/>
+        </w:pBdr>
         <w:autoSpaceDE w:val="0"/>
         <w:autoSpaceDN w:val="0"/>
         <w:adjustRightInd w:val="0"/>
@@ -1742,19 +1885,31 @@
     </w:p>
     <w:p>
       <w:pPr>
-        <w:autoSpaceDE w:val="0"/>
-        <w:autoSpaceDN w:val="0"/>
-        <w:adjustRightInd w:val="0"/>
-        <w:spacing w:after="0" w:line="240" w:lineRule="auto"/>
-        <w:rPr>
-          <w:rFonts w:ascii="Consolas" w:hAnsi="Consolas" w:cs="Consolas"/>
-          <w:sz w:val="19"/>
-          <w:szCs w:val="19"/>
-        </w:rPr>
-      </w:pPr>
-    </w:p>
-    <w:p>
-      <w:pPr>
+        <w:pBdr>
+          <w:top w:val="single" w:sz="4" w:space="1" w:color="auto"/>
+          <w:left w:val="single" w:sz="4" w:space="1" w:color="auto"/>
+          <w:bottom w:val="single" w:sz="4" w:space="1" w:color="auto"/>
+          <w:right w:val="single" w:sz="4" w:space="1" w:color="auto"/>
+        </w:pBdr>
+        <w:autoSpaceDE w:val="0"/>
+        <w:autoSpaceDN w:val="0"/>
+        <w:adjustRightInd w:val="0"/>
+        <w:spacing w:after="0" w:line="240" w:lineRule="auto"/>
+        <w:rPr>
+          <w:rFonts w:ascii="Consolas" w:hAnsi="Consolas" w:cs="Consolas"/>
+          <w:sz w:val="19"/>
+          <w:szCs w:val="19"/>
+        </w:rPr>
+      </w:pPr>
+    </w:p>
+    <w:p>
+      <w:pPr>
+        <w:pBdr>
+          <w:top w:val="single" w:sz="4" w:space="1" w:color="auto"/>
+          <w:left w:val="single" w:sz="4" w:space="1" w:color="auto"/>
+          <w:bottom w:val="single" w:sz="4" w:space="1" w:color="auto"/>
+          <w:right w:val="single" w:sz="4" w:space="1" w:color="auto"/>
+        </w:pBdr>
         <w:autoSpaceDE w:val="0"/>
         <w:autoSpaceDN w:val="0"/>
         <w:adjustRightInd w:val="0"/>
@@ -1777,6 +1932,12 @@
     </w:p>
     <w:p>
       <w:pPr>
+        <w:pBdr>
+          <w:top w:val="single" w:sz="4" w:space="1" w:color="auto"/>
+          <w:left w:val="single" w:sz="4" w:space="1" w:color="auto"/>
+          <w:bottom w:val="single" w:sz="4" w:space="1" w:color="auto"/>
+          <w:right w:val="single" w:sz="4" w:space="1" w:color="auto"/>
+        </w:pBdr>
         <w:autoSpaceDE w:val="0"/>
         <w:autoSpaceDN w:val="0"/>
         <w:adjustRightInd w:val="0"/>
@@ -1809,6 +1970,12 @@
     </w:p>
     <w:p>
       <w:pPr>
+        <w:pBdr>
+          <w:top w:val="single" w:sz="4" w:space="1" w:color="auto"/>
+          <w:left w:val="single" w:sz="4" w:space="1" w:color="auto"/>
+          <w:bottom w:val="single" w:sz="4" w:space="1" w:color="auto"/>
+          <w:right w:val="single" w:sz="4" w:space="1" w:color="auto"/>
+        </w:pBdr>
         <w:autoSpaceDE w:val="0"/>
         <w:autoSpaceDN w:val="0"/>
         <w:adjustRightInd w:val="0"/>
@@ -1831,19 +1998,31 @@
     </w:p>
     <w:p>
       <w:pPr>
-        <w:autoSpaceDE w:val="0"/>
-        <w:autoSpaceDN w:val="0"/>
-        <w:adjustRightInd w:val="0"/>
-        <w:spacing w:after="0" w:line="240" w:lineRule="auto"/>
-        <w:rPr>
-          <w:rFonts w:ascii="Consolas" w:hAnsi="Consolas" w:cs="Consolas"/>
-          <w:sz w:val="19"/>
-          <w:szCs w:val="19"/>
-        </w:rPr>
-      </w:pPr>
-    </w:p>
-    <w:p>
-      <w:pPr>
+        <w:pBdr>
+          <w:top w:val="single" w:sz="4" w:space="1" w:color="auto"/>
+          <w:left w:val="single" w:sz="4" w:space="1" w:color="auto"/>
+          <w:bottom w:val="single" w:sz="4" w:space="1" w:color="auto"/>
+          <w:right w:val="single" w:sz="4" w:space="1" w:color="auto"/>
+        </w:pBdr>
+        <w:autoSpaceDE w:val="0"/>
+        <w:autoSpaceDN w:val="0"/>
+        <w:adjustRightInd w:val="0"/>
+        <w:spacing w:after="0" w:line="240" w:lineRule="auto"/>
+        <w:rPr>
+          <w:rFonts w:ascii="Consolas" w:hAnsi="Consolas" w:cs="Consolas"/>
+          <w:sz w:val="19"/>
+          <w:szCs w:val="19"/>
+        </w:rPr>
+      </w:pPr>
+    </w:p>
+    <w:p>
+      <w:pPr>
+        <w:pBdr>
+          <w:top w:val="single" w:sz="4" w:space="1" w:color="auto"/>
+          <w:left w:val="single" w:sz="4" w:space="1" w:color="auto"/>
+          <w:bottom w:val="single" w:sz="4" w:space="1" w:color="auto"/>
+          <w:right w:val="single" w:sz="4" w:space="1" w:color="auto"/>
+        </w:pBdr>
         <w:autoSpaceDE w:val="0"/>
         <w:autoSpaceDN w:val="0"/>
         <w:adjustRightInd w:val="0"/>
@@ -1866,19 +2045,31 @@
     </w:p>
     <w:p>
       <w:pPr>
-        <w:autoSpaceDE w:val="0"/>
-        <w:autoSpaceDN w:val="0"/>
-        <w:adjustRightInd w:val="0"/>
-        <w:spacing w:after="0" w:line="240" w:lineRule="auto"/>
-        <w:rPr>
-          <w:rFonts w:ascii="Consolas" w:hAnsi="Consolas" w:cs="Consolas"/>
-          <w:sz w:val="19"/>
-          <w:szCs w:val="19"/>
-        </w:rPr>
-      </w:pPr>
-    </w:p>
-    <w:p>
-      <w:pPr>
+        <w:pBdr>
+          <w:top w:val="single" w:sz="4" w:space="1" w:color="auto"/>
+          <w:left w:val="single" w:sz="4" w:space="1" w:color="auto"/>
+          <w:bottom w:val="single" w:sz="4" w:space="1" w:color="auto"/>
+          <w:right w:val="single" w:sz="4" w:space="1" w:color="auto"/>
+        </w:pBdr>
+        <w:autoSpaceDE w:val="0"/>
+        <w:autoSpaceDN w:val="0"/>
+        <w:adjustRightInd w:val="0"/>
+        <w:spacing w:after="0" w:line="240" w:lineRule="auto"/>
+        <w:rPr>
+          <w:rFonts w:ascii="Consolas" w:hAnsi="Consolas" w:cs="Consolas"/>
+          <w:sz w:val="19"/>
+          <w:szCs w:val="19"/>
+        </w:rPr>
+      </w:pPr>
+    </w:p>
+    <w:p>
+      <w:pPr>
+        <w:pBdr>
+          <w:top w:val="single" w:sz="4" w:space="1" w:color="auto"/>
+          <w:left w:val="single" w:sz="4" w:space="1" w:color="auto"/>
+          <w:bottom w:val="single" w:sz="4" w:space="1" w:color="auto"/>
+          <w:right w:val="single" w:sz="4" w:space="1" w:color="auto"/>
+        </w:pBdr>
         <w:autoSpaceDE w:val="0"/>
         <w:autoSpaceDN w:val="0"/>
         <w:adjustRightInd w:val="0"/>
@@ -1901,19 +2092,31 @@
     </w:p>
     <w:p>
       <w:pPr>
-        <w:autoSpaceDE w:val="0"/>
-        <w:autoSpaceDN w:val="0"/>
-        <w:adjustRightInd w:val="0"/>
-        <w:spacing w:after="0" w:line="240" w:lineRule="auto"/>
-        <w:rPr>
-          <w:rFonts w:ascii="Consolas" w:hAnsi="Consolas" w:cs="Consolas"/>
-          <w:sz w:val="19"/>
-          <w:szCs w:val="19"/>
-        </w:rPr>
-      </w:pPr>
-    </w:p>
-    <w:p>
-      <w:pPr>
+        <w:pBdr>
+          <w:top w:val="single" w:sz="4" w:space="1" w:color="auto"/>
+          <w:left w:val="single" w:sz="4" w:space="1" w:color="auto"/>
+          <w:bottom w:val="single" w:sz="4" w:space="1" w:color="auto"/>
+          <w:right w:val="single" w:sz="4" w:space="1" w:color="auto"/>
+        </w:pBdr>
+        <w:autoSpaceDE w:val="0"/>
+        <w:autoSpaceDN w:val="0"/>
+        <w:adjustRightInd w:val="0"/>
+        <w:spacing w:after="0" w:line="240" w:lineRule="auto"/>
+        <w:rPr>
+          <w:rFonts w:ascii="Consolas" w:hAnsi="Consolas" w:cs="Consolas"/>
+          <w:sz w:val="19"/>
+          <w:szCs w:val="19"/>
+        </w:rPr>
+      </w:pPr>
+    </w:p>
+    <w:p>
+      <w:pPr>
+        <w:pBdr>
+          <w:top w:val="single" w:sz="4" w:space="1" w:color="auto"/>
+          <w:left w:val="single" w:sz="4" w:space="1" w:color="auto"/>
+          <w:bottom w:val="single" w:sz="4" w:space="1" w:color="auto"/>
+          <w:right w:val="single" w:sz="4" w:space="1" w:color="auto"/>
+        </w:pBdr>
         <w:autoSpaceDE w:val="0"/>
         <w:autoSpaceDN w:val="0"/>
         <w:adjustRightInd w:val="0"/>
@@ -1936,6 +2139,12 @@
     </w:p>
     <w:p>
       <w:pPr>
+        <w:pBdr>
+          <w:top w:val="single" w:sz="4" w:space="1" w:color="auto"/>
+          <w:left w:val="single" w:sz="4" w:space="1" w:color="auto"/>
+          <w:bottom w:val="single" w:sz="4" w:space="1" w:color="auto"/>
+          <w:right w:val="single" w:sz="4" w:space="1" w:color="auto"/>
+        </w:pBdr>
         <w:autoSpaceDE w:val="0"/>
         <w:autoSpaceDN w:val="0"/>
         <w:adjustRightInd w:val="0"/>
@@ -1978,6 +2187,12 @@
     </w:p>
     <w:p>
       <w:pPr>
+        <w:pBdr>
+          <w:top w:val="single" w:sz="4" w:space="1" w:color="auto"/>
+          <w:left w:val="single" w:sz="4" w:space="1" w:color="auto"/>
+          <w:bottom w:val="single" w:sz="4" w:space="1" w:color="auto"/>
+          <w:right w:val="single" w:sz="4" w:space="1" w:color="auto"/>
+        </w:pBdr>
         <w:autoSpaceDE w:val="0"/>
         <w:autoSpaceDN w:val="0"/>
         <w:adjustRightInd w:val="0"/>
@@ -2020,6 +2235,12 @@
     </w:p>
     <w:p>
       <w:pPr>
+        <w:pBdr>
+          <w:top w:val="single" w:sz="4" w:space="1" w:color="auto"/>
+          <w:left w:val="single" w:sz="4" w:space="1" w:color="auto"/>
+          <w:bottom w:val="single" w:sz="4" w:space="1" w:color="auto"/>
+          <w:right w:val="single" w:sz="4" w:space="1" w:color="auto"/>
+        </w:pBdr>
         <w:autoSpaceDE w:val="0"/>
         <w:autoSpaceDN w:val="0"/>
         <w:adjustRightInd w:val="0"/>
@@ -2052,6 +2273,12 @@
     </w:p>
     <w:p>
       <w:pPr>
+        <w:pBdr>
+          <w:top w:val="single" w:sz="4" w:space="1" w:color="auto"/>
+          <w:left w:val="single" w:sz="4" w:space="1" w:color="auto"/>
+          <w:bottom w:val="single" w:sz="4" w:space="1" w:color="auto"/>
+          <w:right w:val="single" w:sz="4" w:space="1" w:color="auto"/>
+        </w:pBdr>
         <w:autoSpaceDE w:val="0"/>
         <w:autoSpaceDN w:val="0"/>
         <w:adjustRightInd w:val="0"/>
@@ -2074,19 +2301,31 @@
     </w:p>
     <w:p>
       <w:pPr>
-        <w:autoSpaceDE w:val="0"/>
-        <w:autoSpaceDN w:val="0"/>
-        <w:adjustRightInd w:val="0"/>
-        <w:spacing w:after="0" w:line="240" w:lineRule="auto"/>
-        <w:rPr>
-          <w:rFonts w:ascii="Consolas" w:hAnsi="Consolas" w:cs="Consolas"/>
-          <w:sz w:val="19"/>
-          <w:szCs w:val="19"/>
-        </w:rPr>
-      </w:pPr>
-    </w:p>
-    <w:p>
-      <w:pPr>
+        <w:pBdr>
+          <w:top w:val="single" w:sz="4" w:space="1" w:color="auto"/>
+          <w:left w:val="single" w:sz="4" w:space="1" w:color="auto"/>
+          <w:bottom w:val="single" w:sz="4" w:space="1" w:color="auto"/>
+          <w:right w:val="single" w:sz="4" w:space="1" w:color="auto"/>
+        </w:pBdr>
+        <w:autoSpaceDE w:val="0"/>
+        <w:autoSpaceDN w:val="0"/>
+        <w:adjustRightInd w:val="0"/>
+        <w:spacing w:after="0" w:line="240" w:lineRule="auto"/>
+        <w:rPr>
+          <w:rFonts w:ascii="Consolas" w:hAnsi="Consolas" w:cs="Consolas"/>
+          <w:sz w:val="19"/>
+          <w:szCs w:val="19"/>
+        </w:rPr>
+      </w:pPr>
+    </w:p>
+    <w:p>
+      <w:pPr>
+        <w:pBdr>
+          <w:top w:val="single" w:sz="4" w:space="1" w:color="auto"/>
+          <w:left w:val="single" w:sz="4" w:space="1" w:color="auto"/>
+          <w:bottom w:val="single" w:sz="4" w:space="1" w:color="auto"/>
+          <w:right w:val="single" w:sz="4" w:space="1" w:color="auto"/>
+        </w:pBdr>
         <w:autoSpaceDE w:val="0"/>
         <w:autoSpaceDN w:val="0"/>
         <w:adjustRightInd w:val="0"/>
@@ -2109,6 +2348,12 @@
     </w:p>
     <w:p>
       <w:pPr>
+        <w:pBdr>
+          <w:top w:val="single" w:sz="4" w:space="1" w:color="auto"/>
+          <w:left w:val="single" w:sz="4" w:space="1" w:color="auto"/>
+          <w:bottom w:val="single" w:sz="4" w:space="1" w:color="auto"/>
+          <w:right w:val="single" w:sz="4" w:space="1" w:color="auto"/>
+        </w:pBdr>
         <w:autoSpaceDE w:val="0"/>
         <w:autoSpaceDN w:val="0"/>
         <w:adjustRightInd w:val="0"/>
@@ -2151,6 +2396,12 @@
     </w:p>
     <w:p>
       <w:pPr>
+        <w:pBdr>
+          <w:top w:val="single" w:sz="4" w:space="1" w:color="auto"/>
+          <w:left w:val="single" w:sz="4" w:space="1" w:color="auto"/>
+          <w:bottom w:val="single" w:sz="4" w:space="1" w:color="auto"/>
+          <w:right w:val="single" w:sz="4" w:space="1" w:color="auto"/>
+        </w:pBdr>
         <w:autoSpaceDE w:val="0"/>
         <w:autoSpaceDN w:val="0"/>
         <w:adjustRightInd w:val="0"/>
@@ -2174,33 +2425,45 @@
     </w:p>
     <w:p>
       <w:pPr>
-        <w:autoSpaceDE w:val="0"/>
-        <w:autoSpaceDN w:val="0"/>
-        <w:adjustRightInd w:val="0"/>
-        <w:spacing w:after="0" w:line="240" w:lineRule="auto"/>
-        <w:rPr>
-          <w:rFonts w:ascii="Consolas" w:hAnsi="Consolas" w:cs="Consolas"/>
-          <w:sz w:val="19"/>
-          <w:szCs w:val="19"/>
-        </w:rPr>
-      </w:pPr>
-    </w:p>
-    <w:p>
-      <w:pPr>
-        <w:autoSpaceDE w:val="0"/>
-        <w:autoSpaceDN w:val="0"/>
-        <w:adjustRightInd w:val="0"/>
-        <w:spacing w:after="0" w:line="240" w:lineRule="auto"/>
-        <w:rPr>
-          <w:rFonts w:ascii="Consolas" w:hAnsi="Consolas" w:cs="Consolas"/>
-          <w:sz w:val="19"/>
-          <w:szCs w:val="19"/>
-        </w:rPr>
-      </w:pPr>
-      <w:r>
-        <w:rPr>
-          <w:rFonts w:ascii="Consolas" w:hAnsi="Consolas" w:cs="Consolas"/>
-          <w:color w:val="008000"/>
+        <w:pBdr>
+          <w:top w:val="single" w:sz="4" w:space="1" w:color="auto"/>
+          <w:left w:val="single" w:sz="4" w:space="1" w:color="auto"/>
+          <w:bottom w:val="single" w:sz="4" w:space="1" w:color="auto"/>
+          <w:right w:val="single" w:sz="4" w:space="1" w:color="auto"/>
+        </w:pBdr>
+        <w:autoSpaceDE w:val="0"/>
+        <w:autoSpaceDN w:val="0"/>
+        <w:adjustRightInd w:val="0"/>
+        <w:spacing w:after="0" w:line="240" w:lineRule="auto"/>
+        <w:rPr>
+          <w:rFonts w:ascii="Consolas" w:hAnsi="Consolas" w:cs="Consolas"/>
+          <w:sz w:val="19"/>
+          <w:szCs w:val="19"/>
+        </w:rPr>
+      </w:pPr>
+    </w:p>
+    <w:p>
+      <w:pPr>
+        <w:pBdr>
+          <w:top w:val="single" w:sz="4" w:space="1" w:color="auto"/>
+          <w:left w:val="single" w:sz="4" w:space="1" w:color="auto"/>
+          <w:bottom w:val="single" w:sz="4" w:space="1" w:color="auto"/>
+          <w:right w:val="single" w:sz="4" w:space="1" w:color="auto"/>
+        </w:pBdr>
+        <w:autoSpaceDE w:val="0"/>
+        <w:autoSpaceDN w:val="0"/>
+        <w:adjustRightInd w:val="0"/>
+        <w:spacing w:after="0" w:line="240" w:lineRule="auto"/>
+        <w:rPr>
+          <w:rFonts w:ascii="Consolas" w:hAnsi="Consolas" w:cs="Consolas"/>
+          <w:sz w:val="19"/>
+          <w:szCs w:val="19"/>
+        </w:rPr>
+      </w:pPr>
+      <w:r>
+        <w:rPr>
+          <w:rFonts w:ascii="Consolas" w:hAnsi="Consolas" w:cs="Consolas"/>
+          <w:b/>
           <w:sz w:val="19"/>
           <w:szCs w:val="19"/>
         </w:rPr>
@@ -2209,6 +2472,12 @@
     </w:p>
     <w:p>
       <w:pPr>
+        <w:pBdr>
+          <w:top w:val="single" w:sz="4" w:space="1" w:color="auto"/>
+          <w:left w:val="single" w:sz="4" w:space="1" w:color="auto"/>
+          <w:bottom w:val="single" w:sz="4" w:space="1" w:color="auto"/>
+          <w:right w:val="single" w:sz="4" w:space="1" w:color="auto"/>
+        </w:pBdr>
         <w:autoSpaceDE w:val="0"/>
         <w:autoSpaceDN w:val="0"/>
         <w:adjustRightInd w:val="0"/>
@@ -2251,6 +2520,12 @@
     </w:p>
     <w:p>
       <w:pPr>
+        <w:pBdr>
+          <w:top w:val="single" w:sz="4" w:space="1" w:color="auto"/>
+          <w:left w:val="single" w:sz="4" w:space="1" w:color="auto"/>
+          <w:bottom w:val="single" w:sz="4" w:space="1" w:color="auto"/>
+          <w:right w:val="single" w:sz="4" w:space="1" w:color="auto"/>
+        </w:pBdr>
         <w:autoSpaceDE w:val="0"/>
         <w:autoSpaceDN w:val="0"/>
         <w:adjustRightInd w:val="0"/>
@@ -2293,6 +2568,12 @@
     </w:p>
     <w:p>
       <w:pPr>
+        <w:pBdr>
+          <w:top w:val="single" w:sz="4" w:space="1" w:color="auto"/>
+          <w:left w:val="single" w:sz="4" w:space="1" w:color="auto"/>
+          <w:bottom w:val="single" w:sz="4" w:space="1" w:color="auto"/>
+          <w:right w:val="single" w:sz="4" w:space="1" w:color="auto"/>
+        </w:pBdr>
         <w:autoSpaceDE w:val="0"/>
         <w:autoSpaceDN w:val="0"/>
         <w:adjustRightInd w:val="0"/>
@@ -2335,6 +2616,12 @@
     </w:p>
     <w:p>
       <w:pPr>
+        <w:pBdr>
+          <w:top w:val="single" w:sz="4" w:space="1" w:color="auto"/>
+          <w:left w:val="single" w:sz="4" w:space="1" w:color="auto"/>
+          <w:bottom w:val="single" w:sz="4" w:space="1" w:color="auto"/>
+          <w:right w:val="single" w:sz="4" w:space="1" w:color="auto"/>
+        </w:pBdr>
         <w:autoSpaceDE w:val="0"/>
         <w:autoSpaceDN w:val="0"/>
         <w:adjustRightInd w:val="0"/>
@@ -2377,6 +2664,12 @@
     </w:p>
     <w:p>
       <w:pPr>
+        <w:pBdr>
+          <w:top w:val="single" w:sz="4" w:space="1" w:color="auto"/>
+          <w:left w:val="single" w:sz="4" w:space="1" w:color="auto"/>
+          <w:bottom w:val="single" w:sz="4" w:space="1" w:color="auto"/>
+          <w:right w:val="single" w:sz="4" w:space="1" w:color="auto"/>
+        </w:pBdr>
         <w:autoSpaceDE w:val="0"/>
         <w:autoSpaceDN w:val="0"/>
         <w:adjustRightInd w:val="0"/>
@@ -2419,6 +2712,12 @@
     </w:p>
     <w:p>
       <w:pPr>
+        <w:pBdr>
+          <w:top w:val="single" w:sz="4" w:space="1" w:color="auto"/>
+          <w:left w:val="single" w:sz="4" w:space="1" w:color="auto"/>
+          <w:bottom w:val="single" w:sz="4" w:space="1" w:color="auto"/>
+          <w:right w:val="single" w:sz="4" w:space="1" w:color="auto"/>
+        </w:pBdr>
         <w:autoSpaceDE w:val="0"/>
         <w:autoSpaceDN w:val="0"/>
         <w:adjustRightInd w:val="0"/>
@@ -2461,6 +2760,12 @@
     </w:p>
     <w:p>
       <w:pPr>
+        <w:pBdr>
+          <w:top w:val="single" w:sz="4" w:space="1" w:color="auto"/>
+          <w:left w:val="single" w:sz="4" w:space="1" w:color="auto"/>
+          <w:bottom w:val="single" w:sz="4" w:space="1" w:color="auto"/>
+          <w:right w:val="single" w:sz="4" w:space="1" w:color="auto"/>
+        </w:pBdr>
         <w:autoSpaceDE w:val="0"/>
         <w:autoSpaceDN w:val="0"/>
         <w:adjustRightInd w:val="0"/>
@@ -2503,6 +2808,12 @@
     </w:p>
     <w:p>
       <w:pPr>
+        <w:pBdr>
+          <w:top w:val="single" w:sz="4" w:space="1" w:color="auto"/>
+          <w:left w:val="single" w:sz="4" w:space="1" w:color="auto"/>
+          <w:bottom w:val="single" w:sz="4" w:space="1" w:color="auto"/>
+          <w:right w:val="single" w:sz="4" w:space="1" w:color="auto"/>
+        </w:pBdr>
         <w:autoSpaceDE w:val="0"/>
         <w:autoSpaceDN w:val="0"/>
         <w:adjustRightInd w:val="0"/>
@@ -2545,73 +2856,91 @@
     </w:p>
     <w:p>
       <w:pPr>
-        <w:autoSpaceDE w:val="0"/>
-        <w:autoSpaceDN w:val="0"/>
-        <w:adjustRightInd w:val="0"/>
-        <w:spacing w:after="0" w:line="240" w:lineRule="auto"/>
-        <w:rPr>
-          <w:rFonts w:ascii="Consolas" w:hAnsi="Consolas" w:cs="Consolas"/>
-          <w:sz w:val="19"/>
-          <w:szCs w:val="19"/>
-        </w:rPr>
-      </w:pPr>
-      <w:r>
-        <w:rPr>
-          <w:rFonts w:ascii="Consolas" w:hAnsi="Consolas" w:cs="Consolas"/>
-          <w:color w:val="008000"/>
-          <w:sz w:val="19"/>
-          <w:szCs w:val="19"/>
-        </w:rPr>
-        <w:t>-------------------------------------------------------------------</w:t>
-      </w:r>
-      <w:r>
-        <w:rPr>
-          <w:rFonts w:ascii="Consolas" w:hAnsi="Consolas" w:cs="Consolas"/>
-          <w:color w:val="008000"/>
-          <w:sz w:val="19"/>
-          <w:szCs w:val="19"/>
-        </w:rPr>
-        <w:t>----------------------</w:t>
-      </w:r>
-    </w:p>
-    <w:p>
-      <w:pPr>
-        <w:autoSpaceDE w:val="0"/>
-        <w:autoSpaceDN w:val="0"/>
-        <w:adjustRightInd w:val="0"/>
-        <w:spacing w:after="0" w:line="240" w:lineRule="auto"/>
-        <w:rPr>
-          <w:rFonts w:ascii="Consolas" w:hAnsi="Consolas" w:cs="Consolas"/>
-          <w:color w:val="008000"/>
-          <w:sz w:val="19"/>
-          <w:szCs w:val="19"/>
-        </w:rPr>
-      </w:pPr>
-    </w:p>
-    <w:p>
-      <w:pPr>
-        <w:autoSpaceDE w:val="0"/>
-        <w:autoSpaceDN w:val="0"/>
-        <w:adjustRightInd w:val="0"/>
-        <w:spacing w:after="0" w:line="240" w:lineRule="auto"/>
-        <w:rPr>
-          <w:rFonts w:ascii="Consolas" w:hAnsi="Consolas" w:cs="Consolas"/>
-          <w:sz w:val="19"/>
-          <w:szCs w:val="19"/>
-        </w:rPr>
-      </w:pPr>
-      <w:r>
-        <w:rPr>
-          <w:rFonts w:ascii="Consolas" w:hAnsi="Consolas" w:cs="Consolas"/>
-          <w:color w:val="008000"/>
+        <w:pBdr>
+          <w:top w:val="single" w:sz="4" w:space="1" w:color="auto"/>
+          <w:left w:val="single" w:sz="4" w:space="1" w:color="auto"/>
+          <w:bottom w:val="single" w:sz="4" w:space="1" w:color="auto"/>
+          <w:right w:val="single" w:sz="4" w:space="1" w:color="auto"/>
+        </w:pBdr>
+        <w:autoSpaceDE w:val="0"/>
+        <w:autoSpaceDN w:val="0"/>
+        <w:adjustRightInd w:val="0"/>
+        <w:spacing w:after="0" w:line="240" w:lineRule="auto"/>
+        <w:rPr>
+          <w:rFonts w:ascii="Consolas" w:hAnsi="Consolas" w:cs="Consolas"/>
+          <w:sz w:val="19"/>
+          <w:szCs w:val="19"/>
+        </w:rPr>
+      </w:pPr>
+      <w:r>
+        <w:rPr>
+          <w:rFonts w:ascii="Consolas" w:hAnsi="Consolas" w:cs="Consolas"/>
+          <w:color w:val="008000"/>
+          <w:sz w:val="19"/>
+          <w:szCs w:val="19"/>
+        </w:rPr>
+        <w:t>-----------------------------------------------------------------------------------------</w:t>
+      </w:r>
+    </w:p>
+    <w:p>
+      <w:pPr>
+        <w:pBdr>
+          <w:top w:val="single" w:sz="4" w:space="1" w:color="auto"/>
+          <w:left w:val="single" w:sz="4" w:space="1" w:color="auto"/>
+          <w:bottom w:val="single" w:sz="4" w:space="1" w:color="auto"/>
+          <w:right w:val="single" w:sz="4" w:space="1" w:color="auto"/>
+        </w:pBdr>
+        <w:autoSpaceDE w:val="0"/>
+        <w:autoSpaceDN w:val="0"/>
+        <w:adjustRightInd w:val="0"/>
+        <w:spacing w:after="0" w:line="240" w:lineRule="auto"/>
+        <w:rPr>
+          <w:rFonts w:ascii="Consolas" w:hAnsi="Consolas" w:cs="Consolas"/>
+          <w:color w:val="008000"/>
+          <w:sz w:val="19"/>
+          <w:szCs w:val="19"/>
+        </w:rPr>
+      </w:pPr>
+    </w:p>
+    <w:p>
+      <w:pPr>
+        <w:pBdr>
+          <w:top w:val="single" w:sz="4" w:space="1" w:color="auto"/>
+          <w:left w:val="single" w:sz="4" w:space="1" w:color="auto"/>
+          <w:bottom w:val="single" w:sz="4" w:space="1" w:color="auto"/>
+          <w:right w:val="single" w:sz="4" w:space="1" w:color="auto"/>
+        </w:pBdr>
+        <w:autoSpaceDE w:val="0"/>
+        <w:autoSpaceDN w:val="0"/>
+        <w:adjustRightInd w:val="0"/>
+        <w:spacing w:after="0" w:line="240" w:lineRule="auto"/>
+        <w:rPr>
+          <w:rFonts w:ascii="Consolas" w:hAnsi="Consolas" w:cs="Consolas"/>
+          <w:b/>
+          <w:sz w:val="19"/>
+          <w:szCs w:val="19"/>
+        </w:rPr>
+      </w:pPr>
+      <w:bookmarkStart w:id="0" w:name="_GoBack"/>
+      <w:r>
+        <w:rPr>
+          <w:rFonts w:ascii="Consolas" w:hAnsi="Consolas" w:cs="Consolas"/>
+          <w:b/>
           <w:sz w:val="19"/>
           <w:szCs w:val="19"/>
         </w:rPr>
         <w:t>--Other Data Types</w:t>
       </w:r>
     </w:p>
-    <w:p>
-      <w:pPr>
+    <w:bookmarkEnd w:id="0"/>
+    <w:p>
+      <w:pPr>
+        <w:pBdr>
+          <w:top w:val="single" w:sz="4" w:space="1" w:color="auto"/>
+          <w:left w:val="single" w:sz="4" w:space="1" w:color="auto"/>
+          <w:bottom w:val="single" w:sz="4" w:space="1" w:color="auto"/>
+          <w:right w:val="single" w:sz="4" w:space="1" w:color="auto"/>
+        </w:pBdr>
         <w:autoSpaceDE w:val="0"/>
         <w:autoSpaceDN w:val="0"/>
         <w:adjustRightInd w:val="0"/>
@@ -2644,6 +2973,12 @@
     </w:p>
     <w:p>
       <w:pPr>
+        <w:pBdr>
+          <w:top w:val="single" w:sz="4" w:space="1" w:color="auto"/>
+          <w:left w:val="single" w:sz="4" w:space="1" w:color="auto"/>
+          <w:bottom w:val="single" w:sz="4" w:space="1" w:color="auto"/>
+          <w:right w:val="single" w:sz="4" w:space="1" w:color="auto"/>
+        </w:pBdr>
         <w:autoSpaceDE w:val="0"/>
         <w:autoSpaceDN w:val="0"/>
         <w:adjustRightInd w:val="0"/>
@@ -2676,23 +3011,30 @@
     </w:p>
     <w:p>
       <w:pPr>
-        <w:autoSpaceDE w:val="0"/>
-        <w:autoSpaceDN w:val="0"/>
-        <w:adjustRightInd w:val="0"/>
-        <w:spacing w:after="0" w:line="240" w:lineRule="auto"/>
-        <w:rPr>
-          <w:rFonts w:ascii="Consolas" w:hAnsi="Consolas" w:cs="Consolas"/>
-          <w:sz w:val="19"/>
-          <w:szCs w:val="19"/>
-        </w:rPr>
-      </w:pPr>
-      <w:r>
-        <w:rPr>
-          <w:rFonts w:ascii="Consolas" w:hAnsi="Consolas" w:cs="Consolas"/>
-          <w:color w:val="008000"/>
-          <w:sz w:val="19"/>
-          <w:szCs w:val="19"/>
-        </w:rPr>
+        <w:pBdr>
+          <w:top w:val="single" w:sz="4" w:space="1" w:color="auto"/>
+          <w:left w:val="single" w:sz="4" w:space="1" w:color="auto"/>
+          <w:bottom w:val="single" w:sz="4" w:space="1" w:color="auto"/>
+          <w:right w:val="single" w:sz="4" w:space="1" w:color="auto"/>
+        </w:pBdr>
+        <w:autoSpaceDE w:val="0"/>
+        <w:autoSpaceDN w:val="0"/>
+        <w:adjustRightInd w:val="0"/>
+        <w:spacing w:after="0" w:line="240" w:lineRule="auto"/>
+        <w:rPr>
+          <w:rFonts w:ascii="Consolas" w:hAnsi="Consolas" w:cs="Consolas"/>
+          <w:sz w:val="19"/>
+          <w:szCs w:val="19"/>
+        </w:rPr>
+      </w:pPr>
+      <w:r>
+        <w:rPr>
+          <w:rFonts w:ascii="Consolas" w:hAnsi="Consolas" w:cs="Consolas"/>
+          <w:color w:val="008000"/>
+          <w:sz w:val="19"/>
+          <w:szCs w:val="19"/>
+        </w:rPr>
+        <w:lastRenderedPageBreak/>
         <w:t>--uniqueidentifier</w:t>
       </w:r>
       <w:r>
@@ -2708,24 +3050,29 @@
     </w:p>
     <w:p>
       <w:pPr>
-        <w:autoSpaceDE w:val="0"/>
-        <w:autoSpaceDN w:val="0"/>
-        <w:adjustRightInd w:val="0"/>
-        <w:spacing w:after="0" w:line="240" w:lineRule="auto"/>
-        <w:rPr>
-          <w:rFonts w:ascii="Consolas" w:hAnsi="Consolas" w:cs="Consolas"/>
-          <w:sz w:val="19"/>
-          <w:szCs w:val="19"/>
-        </w:rPr>
-      </w:pPr>
-      <w:r>
-        <w:rPr>
-          <w:rFonts w:ascii="Consolas" w:hAnsi="Consolas" w:cs="Consolas"/>
-          <w:color w:val="008000"/>
-          <w:sz w:val="19"/>
-          <w:szCs w:val="19"/>
-        </w:rPr>
-        <w:lastRenderedPageBreak/>
+        <w:pBdr>
+          <w:top w:val="single" w:sz="4" w:space="1" w:color="auto"/>
+          <w:left w:val="single" w:sz="4" w:space="1" w:color="auto"/>
+          <w:bottom w:val="single" w:sz="4" w:space="1" w:color="auto"/>
+          <w:right w:val="single" w:sz="4" w:space="1" w:color="auto"/>
+        </w:pBdr>
+        <w:autoSpaceDE w:val="0"/>
+        <w:autoSpaceDN w:val="0"/>
+        <w:adjustRightInd w:val="0"/>
+        <w:spacing w:after="0" w:line="240" w:lineRule="auto"/>
+        <w:rPr>
+          <w:rFonts w:ascii="Consolas" w:hAnsi="Consolas" w:cs="Consolas"/>
+          <w:sz w:val="19"/>
+          <w:szCs w:val="19"/>
+        </w:rPr>
+      </w:pPr>
+      <w:r>
+        <w:rPr>
+          <w:rFonts w:ascii="Consolas" w:hAnsi="Consolas" w:cs="Consolas"/>
+          <w:color w:val="008000"/>
+          <w:sz w:val="19"/>
+          <w:szCs w:val="19"/>
+        </w:rPr>
         <w:t>--xml</w:t>
       </w:r>
       <w:r>
@@ -2741,6 +3088,12 @@
     </w:p>
     <w:p>
       <w:pPr>
+        <w:pBdr>
+          <w:top w:val="single" w:sz="4" w:space="1" w:color="auto"/>
+          <w:left w:val="single" w:sz="4" w:space="1" w:color="auto"/>
+          <w:bottom w:val="single" w:sz="4" w:space="1" w:color="auto"/>
+          <w:right w:val="single" w:sz="4" w:space="1" w:color="auto"/>
+        </w:pBdr>
         <w:autoSpaceDE w:val="0"/>
         <w:autoSpaceDN w:val="0"/>
         <w:adjustRightInd w:val="0"/>
@@ -2773,6 +3126,12 @@
     </w:p>
     <w:p>
       <w:pPr>
+        <w:pBdr>
+          <w:top w:val="single" w:sz="4" w:space="1" w:color="auto"/>
+          <w:left w:val="single" w:sz="4" w:space="1" w:color="auto"/>
+          <w:bottom w:val="single" w:sz="4" w:space="1" w:color="auto"/>
+          <w:right w:val="single" w:sz="4" w:space="1" w:color="auto"/>
+        </w:pBdr>
         <w:autoSpaceDE w:val="0"/>
         <w:autoSpaceDN w:val="0"/>
         <w:adjustRightInd w:val="0"/>

</xml_diff>